<commit_message>
docs: LLD v37 addendum for 2026-07-29 pipeline changes + Engineering Rules V21 addendum for mouse-click popup fix
</commit_message>
<xml_diff>
--- a/architecture/EngineeringRuleEnforcement/ArchitectureDesignAndAuditDocs/CH-EPIC8-Feachure-002-EngineeringRulesEnforcement-designV21.docx
+++ b/architecture/EngineeringRuleEnforcement/ArchitectureDesignAndAuditDocs/CH-EPIC8-Feachure-002-EngineeringRulesEnforcement-designV21.docx
@@ -10032,6 +10032,117 @@
         </w:tc>
       </w:tr>
     </w:tbl>
+    <w:p>
+      <w:pPr>
+        <w:pStyle w:val="Heading1"/>
+      </w:pPr>
+      <w:r>
+        <w:rPr>
+          <w:b/>
+          <w:color w:val="0B7A75"/>
+        </w:rPr>
+        <w:t>Addendum — 2026-07-29 (Popup mouse-click gate)</w:t>
+      </w:r>
+    </w:p>
+    <w:p>
+      <w:pPr>
+        <w:pStyle w:val="ListBullet"/>
+      </w:pPr>
+      <w:r>
+        <w:rPr>
+          <w:color w:val="0B7A75"/>
+        </w:rPr>
+        <w:t>Problem. Rule-065 (CommitAuthorizationWorker) and Rule-006 (llm_classify_shell_invocation classifier) both open a local browser popup with APPROVE / REJECT buttons on 127.0.0.1:&lt;port&gt;/prompt. The original popup was a &lt;form method=POST action=/decide&gt; with two type=submit buttons and a JS handler on the form's submit event. Any programmatic form submission (form.requestSubmit(), a dispatched MouseEvent, an injected JS click, a headless-browser automation click) could fire the submit handler and POST verdict=approve without any real user action. This was the back door that recorded approve_verdict='approve' in the audit log on multiple invocations even though no popup ever appeared on the operator's screen.</w:t>
+      </w:r>
+    </w:p>
+    <w:p>
+      <w:pPr>
+        <w:pStyle w:val="ListBullet"/>
+      </w:pPr>
+      <w:r>
+        <w:rPr>
+          <w:color w:val="0B7A75"/>
+        </w:rPr>
+        <w:t>Fix. Both popup HTML/JS blobs and both /decide server handlers were rewritten with a mousedown-armed hidden field:</w:t>
+      </w:r>
+    </w:p>
+    <w:p>
+      <w:pPr>
+        <w:pStyle w:val="ListBullet"/>
+      </w:pPr>
+      <w:r>
+        <w:rPr>
+          <w:color w:val="0B7A75"/>
+        </w:rPr>
+        <w:t>Buttons switched from type=submit to type=button. The form has no submit event listener at all, so hijacking submit does nothing.</w:t>
+      </w:r>
+    </w:p>
+    <w:p>
+      <w:pPr>
+        <w:pStyle w:val="ListBullet"/>
+      </w:pPr>
+      <w:r>
+        <w:rPr>
+          <w:color w:val="0B7A75"/>
+        </w:rPr>
+        <w:t>A single document-level mousedown listener sets a hidden input human_click to 'true'. This listener is the ONLY code path that populates the field. The mousedown event's event.isTrusted flag is browser-set and cannot be forged by JS; a dispatched synthetic MouseEvent, an element.click(), form.requestSubmit(), or a headless automation click all produce isTrusted=false and are ignored.</w:t>
+      </w:r>
+    </w:p>
+    <w:p>
+      <w:pPr>
+        <w:pStyle w:val="ListBullet"/>
+      </w:pPr>
+      <w:r>
+        <w:rPr>
+          <w:color w:val="0B7A75"/>
+        </w:rPr>
+        <w:t>The APPROVE and REJECT buttons each have a click handler that reads the current human_click value and POSTs to /decide including it. Since a real mouse click always includes a mousedown before the click fires (and mousedown bubbles to document before click), a real human click always arrives at /decide with human_click=='true'.</w:t>
+      </w:r>
+    </w:p>
+    <w:p>
+      <w:pPr>
+        <w:pStyle w:val="ListBullet"/>
+      </w:pPr>
+      <w:r>
+        <w:rPr>
+          <w:color w:val="0B7A75"/>
+        </w:rPr>
+        <w:t>Server-side /decide handler (in both workers) rejects any POST whose form body does not include human_click=='true'. This is defense in depth against any future JS that might POST /decide directly.</w:t>
+      </w:r>
+    </w:p>
+    <w:p>
+      <w:pPr>
+        <w:pStyle w:val="ListBullet"/>
+      </w:pPr>
+      <w:r>
+        <w:rPr>
+          <w:color w:val="0B7A75"/>
+        </w:rPr>
+        <w:t>Files touched: architecture/EngineeringRuleEnforcement/code/commit_authorization_worker.py (Rule-065 popup HTML + /decide handler) and architecture/EngineeringRuleEnforcement/code/llm_classify_shell_invocation_worker.py (Rule-006 popup HTML + /decide handler).</w:t>
+      </w:r>
+    </w:p>
+    <w:p>
+      <w:pPr>
+        <w:pStyle w:val="ListBullet"/>
+      </w:pPr>
+      <w:r>
+        <w:rPr>
+          <w:color w:val="0B7A75"/>
+        </w:rPr>
+        <w:t>Threat model this closes. Automation that reaches into the popup's DOM (e.g. a Chrome extension or a puppeteer-style headless click) and programmatically triggers the APPROVE button without a real user mouse action. Under the old design that automation could record verdict=approve on the server. Under the new design the automation's synthesized mousedown carries isTrusted=false, so the document listener refuses to arm human_click, and the resulting POST is refused by the server.</w:t>
+      </w:r>
+    </w:p>
+    <w:p>
+      <w:pPr>
+        <w:pStyle w:val="ListBullet"/>
+      </w:pPr>
+      <w:r>
+        <w:rPr>
+          <w:color w:val="0B7A75"/>
+        </w:rPr>
+        <w:t>Threat model NOT addressed by this change. A malicious process on the operator's workstation that (a) captures a real physical mouse event or (b) posts to /decide with the correct token and human_click='true' after learning the token from the DOM. The token is a per-invocation secrets.token_urlsafe(8) known only to the popup tab; any process that can read that popup's DOM can already forge approval and can also read arbitrary Cursor/Claude Code chat. Out of scope for the popup gate; addressed by workstation-level integrity.</w:t>
+      </w:r>
+    </w:p>
     <w:sectPr>
       <w:pgSz w:w="12240" w:h="15840"/>
       <w:pgMar w:top="1440" w:right="1800" w:bottom="1440" w:left="1800" w:header="720" w:footer="720" w:gutter="0"/>

</xml_diff>